<commit_message>
update to naming brand
</commit_message>
<xml_diff>
--- a/docs/AI4I_Proposal_Design.docx
+++ b/docs/AI4I_Proposal_Design.docx
@@ -15,7 +15,19 @@
       </w:pPr>
       <w:r>
         <w:rPr>
-          <w:sz w:val="56"/>
+          <w:sz w:val="64"/>
+        </w:rPr>
+        <w:t>Atlas</w:t>
+      </w:r>
+    </w:p>
+    <w:p>
+      <w:pPr>
+        <w:pStyle w:val="Subtitle"/>
+        <w:jc w:val="center"/>
+      </w:pPr>
+      <w:r>
+        <w:rPr>
+          <w:sz w:val="32"/>
         </w:rPr>
         <w:t>Zimbabwe Tourism</w:t>
         <w:br/>

</xml_diff>